<commit_message>
docs: agrega los requisitos de IA al alcance, README y bitácora (#44)
Co-Authored-By: Claude Opus 5.5 <noreply@anthropic.com>
</commit_message>
<xml_diff>
--- a/docs/PomoPet_Sprint1_Alcance_FINAL.docx
+++ b/docs/PomoPet_Sprint1_Alcance_FINAL.docx
@@ -2312,7 +2312,7 @@
           <w:sz w:val="22"/>
           <w:szCs w:val="22"/>
         </w:rPr>
-        <w:t xml:space="preserve">El sistema debe reducir el HP del Jefe Final activo al completar cada pomodoro asociado.</w:t>
+        <w:t xml:space="preserve">El sistema debe reducir el HP del Jefe Final activo al completar cada pomodoro asociado y al aplicar el daño extra definido en RF-16.</w:t>
       </w:r>
     </w:p>
     <w:p>
@@ -2486,7 +2486,7 @@
           <w:sz w:val="22"/>
           <w:szCs w:val="22"/>
         </w:rPr>
-        <w:t xml:space="preserve">El HP del Jefe Final debe definirse y reducirse en unidades de pomodoros completados (por ejemplo, un Jefe con HP = 8 requiere 8 pomodoros asociados para ser derrotado), y el sistema debe marcar al Jefe como derrotado cuando su HP llegue a cero.</w:t>
+        <w:t xml:space="preserve">El HP del Jefe Final debe definirse y reducirse en unidades de pomodoros completados (por ejemplo, un Jefe con HP = 8 requiere 8 pomodoros asociados para ser derrotado), y el sistema debe marcar al Jefe como derrotado cuando su HP llegue a cero. Como única excepción, el quiz de RF-16 puede restar 1 HP adicional.</w:t>
       </w:r>
     </w:p>
     <w:p>
@@ -2516,6 +2516,93 @@
           <w:szCs w:val="22"/>
         </w:rPr>
         <w:t xml:space="preserve">El sistema debe permitir el registro de usuarios mediante correo electrónico y contraseña propios (registro básico, sin proveedores externos), validando formato de correo y requisitos mínimos de la contraseña.</w:t>
+      </w:r>
+    </w:p>
+    <w:p>
+      <w:pPr>
+        <w:pStyle w:val="ListParagraph"/>
+        <w:numPr>
+          <w:ilvl w:val="0"/>
+          <w:numId w:val="2"/>
+        </w:numPr>
+        <w:spacing w:after="120"/>
+        <w:jc w:val="both"/>
+      </w:pPr>
+      <w:r>
+        <w:rPr>
+          <w:rFonts w:ascii="Calibri" w:cs="Calibri" w:eastAsia="Calibri" w:hAnsi="Calibri"/>
+          <w:b/>
+          <w:bCs/>
+          <w:sz w:val="22"/>
+          <w:szCs w:val="22"/>
+        </w:rPr>
+        <w:t xml:space="preserve">RF-14: </w:t>
+      </w:r>
+      <w:r>
+        <w:rPr>
+          <w:rFonts w:ascii="Calibri" w:cs="Calibri" w:eastAsia="Calibri" w:hAnsi="Calibri"/>
+          <w:sz w:val="22"/>
+          <w:szCs w:val="22"/>
+        </w:rPr>
+        <w:t xml:space="preserve">El sistema debe generar con inteligencia artificial un consejo de estudio personalizado a partir de las estadísticas del usuario, presentado por su mascota, con un máximo de 3 consejos por día.</w:t>
+      </w:r>
+    </w:p>
+    <w:p>
+      <w:pPr>
+        <w:pStyle w:val="ListParagraph"/>
+        <w:numPr>
+          <w:ilvl w:val="0"/>
+          <w:numId w:val="2"/>
+        </w:numPr>
+        <w:spacing w:after="120"/>
+        <w:jc w:val="both"/>
+      </w:pPr>
+      <w:r>
+        <w:rPr>
+          <w:rFonts w:ascii="Calibri" w:cs="Calibri" w:eastAsia="Calibri" w:hAnsi="Calibri"/>
+          <w:b/>
+          <w:bCs/>
+          <w:sz w:val="22"/>
+          <w:szCs w:val="22"/>
+        </w:rPr>
+        <w:t xml:space="preserve">RF-15: </w:t>
+      </w:r>
+      <w:r>
+        <w:rPr>
+          <w:rFonts w:ascii="Calibri" w:cs="Calibri" w:eastAsia="Calibri" w:hAnsi="Calibri"/>
+          <w:sz w:val="22"/>
+          <w:szCs w:val="22"/>
+        </w:rPr>
+        <w:t xml:space="preserve">El sistema debe generar con inteligencia artificial un quiz de 5 preguntas a partir de los apuntes del usuario, disponible una vez por cada pomodoro completado contra un Jefe Final no derrotado.</w:t>
+      </w:r>
+    </w:p>
+    <w:p>
+      <w:pPr>
+        <w:pStyle w:val="ListParagraph"/>
+        <w:numPr>
+          <w:ilvl w:val="0"/>
+          <w:numId w:val="2"/>
+        </w:numPr>
+        <w:spacing w:after="120"/>
+        <w:jc w:val="both"/>
+      </w:pPr>
+      <w:r>
+        <w:rPr>
+          <w:rFonts w:ascii="Calibri" w:cs="Calibri" w:eastAsia="Calibri" w:hAnsi="Calibri"/>
+          <w:b/>
+          <w:bCs/>
+          <w:sz w:val="22"/>
+          <w:szCs w:val="22"/>
+        </w:rPr>
+        <w:t xml:space="preserve">RF-16: </w:t>
+      </w:r>
+      <w:r>
+        <w:rPr>
+          <w:rFonts w:ascii="Calibri" w:cs="Calibri" w:eastAsia="Calibri" w:hAnsi="Calibri"/>
+          <w:sz w:val="22"/>
+          <w:szCs w:val="22"/>
+        </w:rPr>
+        <w:t xml:space="preserve">El sistema debe aplicar 1 HP de daño extra al Jefe Final cuando el usuario acierte al menos 4 de las 5 preguntas del quiz, sin otorgar XP.</w:t>
       </w:r>
     </w:p>
     <w:p>
@@ -2794,6 +2881,35 @@
           <w:szCs w:val="22"/>
         </w:rPr>
         <w:t xml:space="preserve">El entorno de desarrollo debe ser reproducible entre los integrantes del equipo mediante contenedores (Docker Compose para backend y base de datos), documentado en el repositorio para evitar diferencias de configuración local.</w:t>
+      </w:r>
+    </w:p>
+    <w:p>
+      <w:pPr>
+        <w:pStyle w:val="ListParagraph"/>
+        <w:numPr>
+          <w:ilvl w:val="0"/>
+          <w:numId w:val="2"/>
+        </w:numPr>
+        <w:spacing w:after="120"/>
+        <w:jc w:val="both"/>
+      </w:pPr>
+      <w:r>
+        <w:rPr>
+          <w:rFonts w:ascii="Calibri" w:cs="Calibri" w:eastAsia="Calibri" w:hAnsi="Calibri"/>
+          <w:b/>
+          <w:bCs/>
+          <w:sz w:val="22"/>
+          <w:szCs w:val="22"/>
+        </w:rPr>
+        <w:t xml:space="preserve">RNF-10: </w:t>
+      </w:r>
+      <w:r>
+        <w:rPr>
+          <w:rFonts w:ascii="Calibri" w:cs="Calibri" w:eastAsia="Calibri" w:hAnsi="Calibri"/>
+          <w:sz w:val="22"/>
+          <w:szCs w:val="22"/>
+        </w:rPr>
+        <w:t xml:space="preserve">Las llamadas a la inteligencia artificial deben hacerse solo desde el backend, sin exponer la clave ni enviar datos de la cuenta; si el servicio falla, el resto del sistema debe seguir funcionando.</w:t>
       </w:r>
     </w:p>
     <w:p>

</xml_diff>

<commit_message>
docs: incluye la IA en el resto del documento de alcance (#45)
Co-Authored-By: Claude Opus 5.5 <noreply@anthropic.com>
</commit_message>
<xml_diff>
--- a/docs/PomoPet_Sprint1_Alcance_FINAL.docx
+++ b/docs/PomoPet_Sprint1_Alcance_FINAL.docx
@@ -578,7 +578,7 @@
           <w:sz w:val="22"/>
           <w:szCs w:val="22"/>
         </w:rPr>
-        <w:t xml:space="preserve">PomoPet propone llevar esta técnica a una plataforma web interactiva que la enriquece con mecánicas de gamificación: una mascota virtual que evoluciona con el esfuerzo del usuario, un sistema de progresión por materia con rangos de dominio, y un modo de “Jefe Final” pensado para la preparación de exámenes. El objetivo es transformar una herramienta de productividad funcional pero árida en una experiencia motivadora que incentive la constancia y reduzca la procrastinación académica.</w:t>
+        <w:t xml:space="preserve">PomoPet propone llevar esta técnica a una plataforma web interactiva que la enriquece con mecánicas de gamificación: una mascota virtual que evoluciona con el esfuerzo del usuario, un sistema de progresión por materia con rangos de dominio, un modo de “Jefe Final” pensado para la preparación de exámenes, y funciones de inteligencia artificial que personalizan el acompañamiento al estudio. El objetivo es transformar una herramienta de productividad funcional pero árida en una experiencia motivadora que incentive la constancia y reduzca la procrastinación académica.</w:t>
       </w:r>
     </w:p>
     <w:p>
@@ -1433,7 +1433,7 @@
                 <w:sz w:val="20"/>
                 <w:szCs w:val="20"/>
               </w:rPr>
-              <w:t xml:space="preserve">Endpoints de API REST, cálculo de XP, niveles y rangos, validación del tope de 20 materias, validación server-side de la duración de cada Pomodoro antes de otorgar XP, y lógica del modo Jefe Final.</w:t>
+              <w:t xml:space="preserve">Endpoints de API REST, cálculo de XP, niveles y rangos, validación del tope de 20 materias, validación server-side de la duración de cada Pomodoro antes de otorgar XP, lógica del modo Jefe Final e integración con la API de Google Gemini, solo desde el servidor, para generar consejos de estudio y quizzes.</w:t>
             </w:r>
           </w:p>
         </w:tc>
@@ -1643,6 +1643,24 @@
           <w:sz w:val="22"/>
           <w:szCs w:val="22"/>
         </w:rPr>
+        <w:t xml:space="preserve">Para la inteligencia artificial se consume la API de Google Gemini en lugar de entrenar un modelo propio, ya que el proyecto no requiere un modelo especializado y su plan gratuito cubre el uso previsto. Las llamadas se concentran en un único módulo del backend, lo que protege la clave de acceso y permite cambiar de proveedor sin afectar al resto del sistema.</w:t>
+      </w:r>
+    </w:p>
+    <w:p>
+      <w:pPr>
+        <w:spacing w:after="200"/>
+        <w:jc w:val="both"/>
+      </w:pPr>
+      <w:r>
+        <w:rPr>
+          <w:rFonts w:ascii="Calibri" w:cs="Calibri" w:eastAsia="Calibri" w:hAnsi="Calibri"/>
+          <w:b w:val="false"/>
+          <w:bCs w:val="false"/>
+          <w:i w:val="false"/>
+          <w:iCs w:val="false"/>
+          <w:sz w:val="22"/>
+          <w:szCs w:val="22"/>
+        </w:rPr>
         <w:t xml:space="preserve">Esta división de responsabilidades permite además que la arquitectura sea coherente con el objetivo pedagógico del curso: cada lenguaje se aplica en el rol para el cual fue diseñado, evitando una integración artificial o forzada de tecnologías.</w:t>
       </w:r>
     </w:p>
@@ -1828,6 +1846,27 @@
     </w:p>
     <w:p>
       <w:pPr>
+        <w:pStyle w:val="ListParagraph"/>
+        <w:numPr>
+          <w:ilvl w:val="0"/>
+          <w:numId w:val="2"/>
+        </w:numPr>
+        <w:spacing w:after="120"/>
+        <w:jc w:val="both"/>
+      </w:pPr>
+      <w:r>
+        <w:rPr>
+          <w:rFonts w:ascii="Calibri" w:cs="Calibri" w:eastAsia="Calibri" w:hAnsi="Calibri"/>
+          <w:b w:val="false"/>
+          <w:bCs w:val="false"/>
+          <w:sz w:val="22"/>
+          <w:szCs w:val="22"/>
+        </w:rPr>
+        <w:t xml:space="preserve">Integrar inteligencia artificial que brinde consejos de estudio personalizados por medio de la mascota y genere quizzes a partir de los apuntes del estudiante.</w:t>
+      </w:r>
+    </w:p>
+    <w:p>
+      <w:pPr>
         <w:pStyle w:val="Heading2"/>
         <w:spacing w:after="150" w:before="300"/>
       </w:pPr>
@@ -2020,6 +2059,48 @@
           <w:szCs w:val="22"/>
         </w:rPr>
         <w:t xml:space="preserve">Panel de estadísticas de progreso por materia y general.</w:t>
+      </w:r>
+    </w:p>
+    <w:p>
+      <w:pPr>
+        <w:pStyle w:val="ListParagraph"/>
+        <w:numPr>
+          <w:ilvl w:val="0"/>
+          <w:numId w:val="2"/>
+        </w:numPr>
+        <w:spacing w:after="120"/>
+        <w:jc w:val="both"/>
+      </w:pPr>
+      <w:r>
+        <w:rPr>
+          <w:rFonts w:ascii="Calibri" w:cs="Calibri" w:eastAsia="Calibri" w:hAnsi="Calibri"/>
+          <w:b w:val="false"/>
+          <w:bCs w:val="false"/>
+          <w:sz w:val="22"/>
+          <w:szCs w:val="22"/>
+        </w:rPr>
+        <w:t xml:space="preserve">Coach de estudio con inteligencia artificial, con un máximo de 3 consejos diarios por usuario.</w:t>
+      </w:r>
+    </w:p>
+    <w:p>
+      <w:pPr>
+        <w:pStyle w:val="ListParagraph"/>
+        <w:numPr>
+          <w:ilvl w:val="0"/>
+          <w:numId w:val="2"/>
+        </w:numPr>
+        <w:spacing w:after="120"/>
+        <w:jc w:val="both"/>
+      </w:pPr>
+      <w:r>
+        <w:rPr>
+          <w:rFonts w:ascii="Calibri" w:cs="Calibri" w:eastAsia="Calibri" w:hAnsi="Calibri"/>
+          <w:b w:val="false"/>
+          <w:bCs w:val="false"/>
+          <w:sz w:val="22"/>
+          <w:szCs w:val="22"/>
+        </w:rPr>
+        <w:t xml:space="preserve">Quiz generado con inteligencia artificial contra el Jefe Final, que otorga 1 HP de daño extra con al menos 4 de 5 aciertos. Los apuntes se envían a un servicio externo para generar las preguntas, no se almacenan en PomoPet y la interfaz lo advierte al usuario.</w:t>
       </w:r>
     </w:p>
     <w:p>
@@ -3318,6 +3399,118 @@
           </w:p>
         </w:tc>
       </w:tr>
+      <w:tr>
+        <w:tc>
+          <w:tcPr>
+            <w:tcW w:type="dxa" w:w="2600"/>
+            <w:tcMar>
+              <w:top w:type="dxa" w:w="100"/>
+              <w:left w:type="dxa" w:w="120"/>
+              <w:bottom w:type="dxa" w:w="100"/>
+              <w:right w:type="dxa" w:w="120"/>
+            </w:tcMar>
+          </w:tcPr>
+          <w:p>
+            <w:pPr>
+              <w:jc w:val="left"/>
+            </w:pPr>
+            <w:r>
+              <w:rPr>
+                <w:rFonts w:ascii="Calibri" w:cs="Calibri" w:eastAsia="Calibri" w:hAnsi="Calibri"/>
+                <w:b/>
+                <w:bCs/>
+                <w:color w:val="000000"/>
+                <w:sz w:val="20"/>
+                <w:szCs w:val="20"/>
+              </w:rPr>
+              <w:t xml:space="preserve">Pedir un consejo a la mascota</w:t>
+            </w:r>
+          </w:p>
+        </w:tc>
+        <w:tc>
+          <w:tcPr>
+            <w:tcW w:type="dxa" w:w="7960"/>
+            <w:tcMar>
+              <w:top w:type="dxa" w:w="100"/>
+              <w:left w:type="dxa" w:w="120"/>
+              <w:bottom w:type="dxa" w:w="100"/>
+              <w:right w:type="dxa" w:w="120"/>
+            </w:tcMar>
+          </w:tcPr>
+          <w:p>
+            <w:pPr>
+              <w:jc w:val="left"/>
+            </w:pPr>
+            <w:r>
+              <w:rPr>
+                <w:rFonts w:ascii="Calibri" w:cs="Calibri" w:eastAsia="Calibri" w:hAnsi="Calibri"/>
+                <w:b w:val="false"/>
+                <w:bCs w:val="false"/>
+                <w:color w:val="000000"/>
+                <w:sz w:val="20"/>
+                <w:szCs w:val="20"/>
+              </w:rPr>
+              <w:t xml:space="preserve">El usuario solicita un consejo; el sistema lo genera con inteligencia artificial a partir de sus estadísticas y la mascota lo presenta. Si el servicio falla, muestra un consejo de respaldo.</w:t>
+            </w:r>
+          </w:p>
+        </w:tc>
+      </w:tr>
+      <w:tr>
+        <w:tc>
+          <w:tcPr>
+            <w:tcW w:type="dxa" w:w="2600"/>
+            <w:tcMar>
+              <w:top w:type="dxa" w:w="100"/>
+              <w:left w:type="dxa" w:w="120"/>
+              <w:bottom w:type="dxa" w:w="100"/>
+              <w:right w:type="dxa" w:w="120"/>
+            </w:tcMar>
+          </w:tcPr>
+          <w:p>
+            <w:pPr>
+              <w:jc w:val="left"/>
+            </w:pPr>
+            <w:r>
+              <w:rPr>
+                <w:rFonts w:ascii="Calibri" w:cs="Calibri" w:eastAsia="Calibri" w:hAnsi="Calibri"/>
+                <w:b/>
+                <w:bCs/>
+                <w:color w:val="000000"/>
+                <w:sz w:val="20"/>
+                <w:szCs w:val="20"/>
+              </w:rPr>
+              <w:t xml:space="preserve">Hacer un quiz contra el Jefe Final</w:t>
+            </w:r>
+          </w:p>
+        </w:tc>
+        <w:tc>
+          <w:tcPr>
+            <w:tcW w:type="dxa" w:w="7960"/>
+            <w:tcMar>
+              <w:top w:type="dxa" w:w="100"/>
+              <w:left w:type="dxa" w:w="120"/>
+              <w:bottom w:type="dxa" w:w="100"/>
+              <w:right w:type="dxa" w:w="120"/>
+            </w:tcMar>
+          </w:tcPr>
+          <w:p>
+            <w:pPr>
+              <w:jc w:val="left"/>
+            </w:pPr>
+            <w:r>
+              <w:rPr>
+                <w:rFonts w:ascii="Calibri" w:cs="Calibri" w:eastAsia="Calibri" w:hAnsi="Calibri"/>
+                <w:b w:val="false"/>
+                <w:bCs w:val="false"/>
+                <w:color w:val="000000"/>
+                <w:sz w:val="20"/>
+                <w:szCs w:val="20"/>
+              </w:rPr>
+              <w:t xml:space="preserve">Tras completar un pomodoro contra un Jefe no derrotado, el usuario pega sus apuntes y responde 5 preguntas generadas con inteligencia artificial. Con al menos 4 aciertos, el Jefe pierde 1 HP extra; el quiz no otorga XP.</w:t>
+            </w:r>
+          </w:p>
+        </w:tc>
+      </w:tr>
     </w:tbl>
     <w:p>
       <w:r>
@@ -3566,6 +3759,27 @@
           <w:szCs w:val="22"/>
         </w:rPr>
         <w:t xml:space="preserve">Pruebas de integración entre las tres capas (Vue 3 – FastAPI – PostgreSQL).</w:t>
+      </w:r>
+    </w:p>
+    <w:p>
+      <w:pPr>
+        <w:pStyle w:val="ListParagraph"/>
+        <w:numPr>
+          <w:ilvl w:val="0"/>
+          <w:numId w:val="2"/>
+        </w:numPr>
+        <w:spacing w:after="120"/>
+        <w:jc w:val="both"/>
+      </w:pPr>
+      <w:r>
+        <w:rPr>
+          <w:rFonts w:ascii="Calibri" w:cs="Calibri" w:eastAsia="Calibri" w:hAnsi="Calibri"/>
+          <w:b w:val="false"/>
+          <w:bCs w:val="false"/>
+          <w:sz w:val="22"/>
+          <w:szCs w:val="22"/>
+        </w:rPr>
+        <w:t xml:space="preserve">Integración con la API de Google Gemini para el coach de estudio y el quiz contra el Jefe Final.</w:t>
       </w:r>
     </w:p>
     <w:p>
@@ -4088,7 +4302,7 @@
           <w:sz w:val="22"/>
           <w:szCs w:val="22"/>
         </w:rPr>
-        <w:t xml:space="preserve">PomoPet integra un método de gestión del tiempo con respaldo empírico —la Técnica Pomodoro (Cirillo, 2018)— con principios de gamificación fundamentados en la Teoría de la Autodeterminación (Deci &amp; Ryan, 2000), articulando ambos en una arquitectura de tres capas (Vue 3, FastAPI y PostgreSQL) que cumple el requisito de integración de al menos tres lenguajes de programación exigido por el curso.</w:t>
+        <w:t xml:space="preserve">PomoPet integra un método de gestión del tiempo con respaldo empírico —la Técnica Pomodoro (Cirillo, 2018)— con principios de gamificación fundamentados en la Teoría de la Autodeterminación (Deci &amp; Ryan, 2000), articulando ambos en una arquitectura de tres capas (Vue 3, FastAPI y PostgreSQL) que cumple el requisito de integración de al menos tres lenguajes de programación exigido por el curso. Además, incorpora inteligencia artificial mediante la API de Google Gemini para personalizar el acompañamiento al estudio y reforzar el repaso con quizzes.</w:t>
       </w:r>
     </w:p>
     <w:p>
@@ -4184,6 +4398,39 @@
           <w:szCs w:val="22"/>
         </w:rPr>
         <w:t xml:space="preserve">Félix da Silva, A. R., Pereira, A. M. F., Fernandes, S. C. S., de Lira, N. E. T., &amp; Bittencourt, I. I. (2022). O uso da teoria da autodeterminação no contexto da gamificação. Revista Latinoamericana de Tecnología Educativa, 21(2), 59–82.</w:t>
+      </w:r>
+    </w:p>
+    <w:p>
+      <w:pPr>
+        <w:spacing w:after="200"/>
+        <w:ind w:left="720" w:hanging="720"/>
+        <w:jc w:val="both"/>
+      </w:pPr>
+      <w:r>
+        <w:rPr>
+          <w:rFonts w:ascii="Calibri" w:cs="Calibri" w:eastAsia="Calibri" w:hAnsi="Calibri"/>
+          <w:sz w:val="22"/>
+          <w:szCs w:val="22"/>
+        </w:rPr>
+        <w:t xml:space="preserve">Google. (2026). </w:t>
+      </w:r>
+      <w:r>
+        <w:rPr>
+          <w:rFonts w:ascii="Calibri" w:cs="Calibri" w:eastAsia="Calibri" w:hAnsi="Calibri"/>
+          <w:i/>
+          <w:iCs/>
+          <w:sz w:val="22"/>
+          <w:szCs w:val="22"/>
+        </w:rPr>
+        <w:t xml:space="preserve">Gemini API documentation</w:t>
+      </w:r>
+      <w:r>
+        <w:rPr>
+          <w:rFonts w:ascii="Calibri" w:cs="Calibri" w:eastAsia="Calibri" w:hAnsi="Calibri"/>
+          <w:sz w:val="22"/>
+          <w:szCs w:val="22"/>
+        </w:rPr>
+        <w:t xml:space="preserve">. https://ai.google.dev/gemini-api/docs</w:t>
       </w:r>
     </w:p>
     <w:p>

</xml_diff>